<commit_message>
Feat: Complete LBG 35 weeks with new PPCT logic and rotation rules
</commit_message>
<xml_diff>
--- a/Hệ thống mẫu văn bản/Nguyên đã làm/Lịch báo giảng/Lịch báo giảng - Tuần 02 (THCS).docx
+++ b/Hệ thống mẫu văn bản/Nguyên đã làm/Lịch báo giảng/Lịch báo giảng - Tuần 02 (THCS).docx
@@ -5037,7 +5037,7 @@
                 <w:sz w:val="26"/>
                 <w:szCs w:val="26"/>
               </w:rPr>
-              <w:t>Tiết 0: Định hướng môn học</w:t>
+              <w:t>Bài 1. Thông tin và dữ liệu</w:t>
             </w:r>
           </w:p>
         </w:tc>
@@ -5150,7 +5150,7 @@
                 <w:sz w:val="26"/>
                 <w:szCs w:val="26"/>
               </w:rPr>
-              <w:t>1</w:t>
+              <w:t>2</w:t>
             </w:r>
           </w:p>
         </w:tc>
@@ -5237,7 +5237,7 @@
                 <w:sz w:val="26"/>
                 <w:szCs w:val="26"/>
               </w:rPr>
-              <w:t>Tiết 0: Định hướng môn học</w:t>
+              <w:t>Bài 2. Xử lí thông tin</w:t>
             </w:r>
           </w:p>
         </w:tc>
@@ -7035,7 +7035,7 @@
                 <w:sz w:val="26"/>
                 <w:szCs w:val="26"/>
               </w:rPr>
-              <w:t>1</w:t>
+              <w:t>0</w:t>
             </w:r>
           </w:p>
         </w:tc>
@@ -7238,7 +7238,7 @@
                 <w:sz w:val="26"/>
                 <w:szCs w:val="26"/>
               </w:rPr>
-              <w:t>1</w:t>
+              <w:t>0</w:t>
             </w:r>
           </w:p>
         </w:tc>
@@ -9543,7 +9543,7 @@
                 <w:sz w:val="26"/>
                 <w:szCs w:val="26"/>
               </w:rPr>
-              <w:t>Tiết 0: Định hướng môn học</w:t>
+              <w:t>Bài 1. Lược sử công cụ tính toán</w:t>
             </w:r>
           </w:p>
         </w:tc>
@@ -9656,7 +9656,7 @@
                 <w:sz w:val="26"/>
                 <w:szCs w:val="26"/>
               </w:rPr>
-              <w:t>1</w:t>
+              <w:t>2</w:t>
             </w:r>
           </w:p>
         </w:tc>
@@ -9743,7 +9743,7 @@
                 <w:sz w:val="26"/>
                 <w:szCs w:val="26"/>
               </w:rPr>
-              <w:t>Tiết 0: Định hướng môn học</w:t>
+              <w:t>Bài 2. Thông tin trong môi trường số</w:t>
             </w:r>
           </w:p>
         </w:tc>

</xml_diff>

<commit_message>
Cập nhật Lịch báo giảng 35 tuần: Bỏ quy tắc offset T2/T3, giữ nguyên rotation lớp 5-8
</commit_message>
<xml_diff>
--- a/Hệ thống mẫu văn bản/Nguyên đã làm/Lịch báo giảng/Lịch báo giảng - Tuần 02 (THCS).docx
+++ b/Hệ thống mẫu văn bản/Nguyên đã làm/Lịch báo giảng/Lịch báo giảng - Tuần 02 (THCS).docx
@@ -7035,7 +7035,7 @@
                 <w:sz w:val="26"/>
                 <w:szCs w:val="26"/>
               </w:rPr>
-              <w:t>0</w:t>
+              <w:t>1</w:t>
             </w:r>
           </w:p>
         </w:tc>
@@ -7122,7 +7122,7 @@
                 <w:sz w:val="26"/>
                 <w:szCs w:val="26"/>
               </w:rPr>
-              <w:t>Tiết 0: Định hướng môn học</w:t>
+              <w:t>Bài 1. Thiết bị vào - ra</w:t>
             </w:r>
           </w:p>
         </w:tc>
@@ -7238,7 +7238,7 @@
                 <w:sz w:val="26"/>
                 <w:szCs w:val="26"/>
               </w:rPr>
-              <w:t>0</w:t>
+              <w:t>2</w:t>
             </w:r>
           </w:p>
         </w:tc>
@@ -7325,7 +7325,7 @@
                 <w:sz w:val="26"/>
                 <w:szCs w:val="26"/>
               </w:rPr>
-              <w:t>Tiết 0: Định hướng môn học</w:t>
+              <w:t>Bài 2. Phần mềm máy tính</w:t>
             </w:r>
           </w:p>
         </w:tc>

</xml_diff>